<commit_message>
Update Lab 01 for 26-27 academic year.
</commit_message>
<xml_diff>
--- a/Lab 01/Lab_01.docx
+++ b/Lab 01/Lab_01.docx
@@ -31,10 +31,10 @@
         <w:pStyle w:val="Date"/>
       </w:pPr>
       <w:r>
-        <w:t xml:space="preserve">2025-09-30</w:t>
-      </w:r>
-    </w:p>
-    <w:bookmarkStart w:id="22" w:name="learning-objectives"/>
+        <w:t xml:space="preserve">2026-09-19</w:t>
+      </w:r>
+    </w:p>
+    <w:bookmarkStart w:id="11" w:name="learning-objectives"/>
     <w:p>
       <w:pPr>
         <w:pStyle w:val="Heading1"/>
@@ -46,12 +46,12 @@
         <w:rPr>
           <w:rStyle w:val="FootnoteReference"/>
         </w:rPr>
-        <w:footnoteReference w:id="20"/>
-      </w:r>
-    </w:p>
-    <w:p>
-      <w:pPr>
-        <w:pStyle w:val="BodyText"/>
+        <w:footnoteReference w:id="9"/>
+      </w:r>
+    </w:p>
+    <w:p>
+      <w:pPr>
+        <w:pStyle w:val="FirstParagraph"/>
       </w:pPr>
       <w:r>
         <w:t xml:space="preserve">After working through these materials you should be able to:</w:t>
@@ -189,8 +189,8 @@
         <w:t xml:space="preserve">To be able to ask questions from R about the type, class, and structure of an object.</w:t>
       </w:r>
     </w:p>
-    <w:bookmarkEnd w:id="22"/>
-    <w:bookmarkStart w:id="27" w:name="r-and-rstudio"/>
+    <w:bookmarkEnd w:id="11"/>
+    <w:bookmarkStart w:id="16" w:name="r-and-rstudio"/>
     <w:p>
       <w:pPr>
         <w:pStyle w:val="Heading1"/>
@@ -239,7 +239,7 @@
         <w:rPr>
           <w:rStyle w:val="FootnoteReference"/>
         </w:rPr>
-        <w:footnoteReference w:id="23"/>
+        <w:footnoteReference w:id="12"/>
       </w:r>
       <w:r>
         <w:t xml:space="preserve">.</w:t>
@@ -259,7 +259,7 @@
       <w:r>
         <w:t xml:space="preserve"> </w:t>
       </w:r>
-      <w:hyperlink r:id="rId25">
+      <w:hyperlink r:id="rId14">
         <w:r>
           <w:rPr>
             <w:rStyle w:val="Hyperlink"/>
@@ -282,7 +282,7 @@
       <w:r>
         <w:t xml:space="preserve"> </w:t>
       </w:r>
-      <w:hyperlink r:id="rId26">
+      <w:hyperlink r:id="rId15">
         <w:r>
           <w:rPr>
             <w:rStyle w:val="Hyperlink"/>
@@ -299,8 +299,8 @@
         <w:t xml:space="preserve">Both programmes should be installed on the computer workstation machines. If you can’t find them in the Start menu, try searching for them. If you are using your own machine, please make sure both programmes are installed.</w:t>
       </w:r>
     </w:p>
-    <w:bookmarkEnd w:id="27"/>
-    <w:bookmarkStart w:id="31" w:name="an-r-refresher"/>
+    <w:bookmarkEnd w:id="16"/>
+    <w:bookmarkStart w:id="20" w:name="an-r-refresher"/>
     <w:p>
       <w:pPr>
         <w:pStyle w:val="Heading1"/>
@@ -319,7 +319,7 @@
       <w:r>
         <w:t xml:space="preserve"> </w:t>
       </w:r>
-      <w:hyperlink r:id="rId28">
+      <w:hyperlink r:id="rId17">
         <w:r>
           <w:rPr>
             <w:rStyle w:val="Hyperlink"/>
@@ -330,7 +330,7 @@
       <w:r>
         <w:t xml:space="preserve"> </w:t>
       </w:r>
-      <w:hyperlink r:id="rId21">
+      <w:hyperlink r:id="rId10">
         <w:r>
           <w:rPr>
             <w:rStyle w:val="Hyperlink"/>
@@ -363,7 +363,7 @@
       <w:r>
         <w:t xml:space="preserve"> </w:t>
       </w:r>
-      <w:hyperlink r:id="rId29">
+      <w:hyperlink r:id="rId18">
         <w:r>
           <w:rPr>
             <w:rStyle w:val="Hyperlink"/>
@@ -385,7 +385,7 @@
       <w:r>
         <w:t xml:space="preserve"> </w:t>
       </w:r>
-      <w:hyperlink r:id="rId30">
+      <w:hyperlink r:id="rId19">
         <w:r>
           <w:rPr>
             <w:rStyle w:val="Hyperlink"/>
@@ -394,8 +394,8 @@
         </w:r>
       </w:hyperlink>
     </w:p>
-    <w:bookmarkEnd w:id="31"/>
-    <w:bookmarkStart w:id="35" w:name="finding-help"/>
+    <w:bookmarkEnd w:id="20"/>
+    <w:bookmarkStart w:id="24" w:name="finding-help"/>
     <w:p>
       <w:pPr>
         <w:pStyle w:val="Heading1"/>
@@ -426,7 +426,7 @@
       <w:r>
         <w:t xml:space="preserve"> </w:t>
       </w:r>
-      <w:hyperlink r:id="rId32">
+      <w:hyperlink r:id="rId21">
         <w:r>
           <w:rPr>
             <w:rStyle w:val="Hyperlink"/>
@@ -445,7 +445,7 @@
       <w:r>
         <w:t xml:space="preserve"> </w:t>
       </w:r>
-      <w:hyperlink r:id="rId33">
+      <w:hyperlink r:id="rId22">
         <w:r>
           <w:rPr>
             <w:rStyle w:val="Hyperlink"/>
@@ -459,7 +459,7 @@
       <w:r>
         <w:t xml:space="preserve"> </w:t>
       </w:r>
-      <w:hyperlink r:id="rId34">
+      <w:hyperlink r:id="rId23">
         <w:r>
           <w:rPr>
             <w:rStyle w:val="Hyperlink"/>
@@ -471,8 +471,8 @@
         <w:t xml:space="preserve">.</w:t>
       </w:r>
     </w:p>
-    <w:bookmarkEnd w:id="35"/>
-    <w:bookmarkStart w:id="36" w:name="homework"/>
+    <w:bookmarkEnd w:id="24"/>
+    <w:bookmarkStart w:id="25" w:name="homework"/>
     <w:p>
       <w:pPr>
         <w:pStyle w:val="Heading1"/>
@@ -489,8 +489,12 @@
         <w:t xml:space="preserve">Make sure you have worked through both lessons (01 and 04) from the R for Reproducible Scientific Analysis course.</w:t>
       </w:r>
     </w:p>
-    <w:bookmarkEnd w:id="36"/>
-    <w:sectPr/>
+    <w:bookmarkEnd w:id="25"/>
+    <w:sectPr>
+      <w:footnotePr>
+        <w:numRestart w:val="eachSect"/>
+      </w:footnotePr>
+    </w:sectPr>
   </w:body>
 </w:document>
 </file>
@@ -515,7 +519,7 @@
       </w:r>
     </w:p>
   </w:footnote>
-  <w:footnote w:id="20">
+  <w:footnote w:id="9">
     <w:p>
       <w:pPr>
         <w:pStyle w:val="FootnoteText"/>
@@ -535,7 +539,7 @@
       <w:r>
         <w:t xml:space="preserve"> </w:t>
       </w:r>
-      <w:hyperlink r:id="rId21">
+      <w:hyperlink r:id="rId10">
         <w:r>
           <w:rPr>
             <w:rStyle w:val="Hyperlink"/>
@@ -545,7 +549,7 @@
       </w:hyperlink>
     </w:p>
   </w:footnote>
-  <w:footnote w:id="23">
+  <w:footnote w:id="12">
     <w:p>
       <w:pPr>
         <w:pStyle w:val="FootnoteText"/>
@@ -565,7 +569,7 @@
       <w:r>
         <w:t xml:space="preserve"> </w:t>
       </w:r>
-      <w:hyperlink r:id="rId24">
+      <w:hyperlink r:id="rId13">
         <w:r>
           <w:rPr>
             <w:rStyle w:val="Hyperlink"/>
@@ -921,10 +925,10 @@
   <w:docDefaults>
     <w:rPrDefault>
       <w:rPr>
-        <w:rFonts w:asciiTheme="minorHAnsi" w:cstheme="minorBidi" w:eastAsiaTheme="minorHAnsi" w:hAnsiTheme="minorHAnsi"/>
+        <w:rFonts w:asciiTheme="minorHAnsi" w:cstheme="minorBidi" w:eastAsiaTheme="minorEastAsia" w:hAnsiTheme="minorHAnsi"/>
         <w:sz w:val="24"/>
         <w:szCs w:val="24"/>
-        <w:lang w:bidi="ar-SA" w:eastAsia="en-US" w:val="en-US"/>
+        <w:lang w:bidi="ar-SA" w:eastAsia="zh-CN" w:val="en-US"/>
       </w:rPr>
     </w:rPrDefault>
     <w:pPrDefault>
@@ -976,8 +980,6 @@
     </w:pPr>
     <w:rPr>
       <w:rFonts w:asciiTheme="majorHAnsi" w:cstheme="majorBidi" w:eastAsiaTheme="majorEastAsia" w:hAnsiTheme="majorHAnsi"/>
-      <w:spacing w:val="-10"/>
-      <w:kern w:val="28"/>
       <w:sz w:val="56"/>
       <w:szCs w:val="56"/>
     </w:rPr>
@@ -990,8 +992,6 @@
     <w:rsid w:val="00A10FD9"/>
     <w:rPr>
       <w:rFonts w:asciiTheme="majorHAnsi" w:cstheme="majorBidi" w:eastAsiaTheme="majorEastAsia" w:hAnsiTheme="majorHAnsi"/>
-      <w:spacing w:val="-10"/>
-      <w:kern w:val="28"/>
       <w:sz w:val="56"/>
       <w:szCs w:val="56"/>
     </w:rPr>
@@ -1032,23 +1032,31 @@
   </w:style>
   <w:style w:customStyle="1" w:styleId="Author" w:type="paragraph">
     <w:name w:val="Author"/>
+    <w:basedOn w:val="Title"/>
     <w:next w:val="BodyText"/>
     <w:qFormat/>
     <w:pPr>
       <w:keepNext/>
       <w:keepLines/>
-      <w:jc w:val="center"/>
-    </w:pPr>
+    </w:pPr>
+    <w:rPr>
+      <w:sz w:val="24"/>
+      <w:szCs w:val="24"/>
+    </w:rPr>
   </w:style>
   <w:style w:styleId="Date" w:type="paragraph">
     <w:name w:val="Date"/>
+    <w:basedOn w:val="Title"/>
     <w:next w:val="BodyText"/>
     <w:qFormat/>
     <w:pPr>
       <w:keepNext/>
       <w:keepLines/>
-      <w:jc w:val="center"/>
-    </w:pPr>
+    </w:pPr>
+    <w:rPr>
+      <w:sz w:val="24"/>
+      <w:szCs w:val="24"/>
+    </w:rPr>
   </w:style>
   <w:style w:customStyle="1" w:styleId="AbstractTitle" w:type="paragraph">
     <w:name w:val="Abstract Title"/>
@@ -1461,13 +1469,6 @@
       </w:tblCellMar>
     </w:tblPr>
     <w:tblStylePr w:type="firstRow">
-      <w:tblPr>
-        <w:jc w:val="left"/>
-        <w:tblInd w:type="dxa" w:w="0"/>
-      </w:tblPr>
-      <w:trPr>
-        <w:jc w:val="left"/>
-      </w:trPr>
       <w:tcPr>
         <w:tcBorders>
           <w:bottom w:val="single"/>

</xml_diff>